<commit_message>
Renato Aragão: gancho mais forte na parte 1
Co-Authored-By: Claude Opus 5.5 <noreply@anthropic.com>
Claude-Session: https://claude.ai/code/session_01MJjUEEZrxQDEUifKK2vj9g
</commit_message>
<xml_diff>
--- a/roteiros/renato-aragao/RenatoAragao_Parte1_Introducao.docx
+++ b/roteiros/renato-aragao/RenatoAragao_Parte1_Introducao.docx
@@ -23,7 +23,7 @@
         <w:rPr>
           <w:color w:val="C00000"/>
         </w:rPr>
-        <w:t>O que pouca gente sabe é que existe um documentário, com dezenas de depoimentos, que nenhuma plataforma teve coragem de exibir. E o que se diz ali sobre o Didi é arrepiante.</w:t>
+        <w:t>O que pouca gente sabe é que o homem que passou vinte e seis anos pedindo doações para as crianças do Brasil tem uma filha que precisou fazer vaquinha na internet para comprar remédio.</w:t>
       </w:r>
     </w:p>
     <w:p>
@@ -31,7 +31,7 @@
         <w:rPr>
           <w:color w:val="C00000"/>
         </w:rPr>
-        <w:t>Fique até o final, porque você vai descobrir o que ele teria dito sobre Mussum e Zacarias no dia em que o grupo se desfez. Uma frase tão repugnante que muita gente se recusa a acreditar.</w:t>
+        <w:t>Fique até o final, porque essa nem é a parte mais repugnante. Você vai descobrir o que, segundo quem estava nos bastidores, era deixado na cadeira de Mussum. E quanto o Didi ganhava enquanto os próprios parceiros ficavam com as migalhas.</w:t>
       </w:r>
     </w:p>
     <w:p>
@@ -111,7 +111,7 @@
         <w:rPr>
           <w:color w:val="C00000"/>
         </w:rPr>
-        <w:t>Guarde esse documentário na sua cabeça. Porque, nas horas de gravação que ninguém quis mostrar, há relatos sobre dinheiro, sobre humilhações e sobre a cadeira de Mussum. E o que teria sido deixado naquela cadeira vai te deixar sem palavras.</w:t>
+        <w:t>Guarde esse documentário na sua cabeça. Porque, nas horas de gravação que ninguém quis mostrar, há relatos sobre dinheiro e humilhações nos bastidores. E há uma frase atribuída ao Didi, dita no dia em que o grupo se desfez, tão sombria que muita gente se recusa a acreditar.</w:t>
       </w:r>
     </w:p>
     <w:p>

</xml_diff>

<commit_message>
Renato Aragão: ponte do gancho
Co-Authored-By: Claude Opus 5.5 <noreply@anthropic.com>
Claude-Session: https://claude.ai/code/session_01MJjUEEZrxQDEUifKK2vj9g
</commit_message>
<xml_diff>
--- a/roteiros/renato-aragao/RenatoAragao_Parte1_Introducao.docx
+++ b/roteiros/renato-aragao/RenatoAragao_Parte1_Introducao.docx
@@ -32,6 +32,14 @@
           <w:color w:val="C00000"/>
         </w:rPr>
         <w:t>Fique até o final, porque essa nem é a parte mais repugnante. Você vai descobrir o que, segundo quem estava nos bastidores, era deixado na cadeira de Mussum. E quanto o Didi ganhava enquanto os próprios parceiros ficavam com as migalhas.</w:t>
+      </w:r>
+    </w:p>
+    <w:p>
+      <w:r>
+        <w:rPr>
+          <w:color w:val="000000"/>
+        </w:rPr>
+        <w:t>Mas, para entender como o palhaço mais querido do país chegou a esse ponto, é preciso abrir um arquivo que muita gente preferiu manter fechado.</w:t>
       </w:r>
     </w:p>
     <w:p>

</xml_diff>

<commit_message>
Renato Aragão: gancho reescrito
Co-Authored-By: Claude Opus 5.5 <noreply@anthropic.com>
Claude-Session: https://claude.ai/code/session_01MJjUEEZrxQDEUifKK2vj9g
</commit_message>
<xml_diff>
--- a/roteiros/renato-aragao/RenatoAragao_Parte1_Introducao.docx
+++ b/roteiros/renato-aragao/RenatoAragao_Parte1_Introducao.docx
@@ -15,7 +15,7 @@
         <w:rPr>
           <w:color w:val="C00000"/>
         </w:rPr>
-        <w:t>Renato Aragão passou quarenta e quatro anos na Globo como o palhaço mais amado do Brasil. Mas quem trabalhou ao lado dele conta uma história muito mais sombria.</w:t>
+        <w:t>Renato Aragão fez o Brasil rir por mais de cinquenta anos. Mas, longe das câmeras, as pessoas mais próximas dele contam uma história sombria.</w:t>
       </w:r>
     </w:p>
     <w:p>
@@ -23,7 +23,7 @@
         <w:rPr>
           <w:color w:val="C00000"/>
         </w:rPr>
-        <w:t>O que pouca gente sabe é que o homem que passou vinte e seis anos pedindo doações para as crianças do Brasil tem uma filha que precisou fazer vaquinha na internet para comprar remédio.</w:t>
+        <w:t>Uma das filhas do Didi hoje trabalha como motorista de aplicativo e já precisou pedir ajuda na internet para comprar remédio. E essa é só a primeira das histórias que o público nunca ouviu.</w:t>
       </w:r>
     </w:p>
     <w:p>
@@ -31,7 +31,7 @@
         <w:rPr>
           <w:color w:val="C00000"/>
         </w:rPr>
-        <w:t>Fique até o final, porque essa nem é a parte mais repugnante. Você vai descobrir o que, segundo quem estava nos bastidores, era deixado na cadeira de Mussum. E quanto o Didi ganhava enquanto os próprios parceiros ficavam com as migalhas.</w:t>
+        <w:t>Fique até o final, porque você vai descobrir o que Mussum e Zacarias viveram nos bastidores dos Trapalhões. E a frase cruel que, segundo quem estava lá, o Didi disse sobre os próprios parceiros.</w:t>
       </w:r>
     </w:p>
     <w:p>

</xml_diff>

<commit_message>
Renato Aragão: gancho mais vago
Co-Authored-By: Claude Opus 5.5 <noreply@anthropic.com>
Claude-Session: https://claude.ai/code/session_01MJjUEEZrxQDEUifKK2vj9g
</commit_message>
<xml_diff>
--- a/roteiros/renato-aragao/RenatoAragao_Parte1_Introducao.docx
+++ b/roteiros/renato-aragao/RenatoAragao_Parte1_Introducao.docx
@@ -23,7 +23,7 @@
         <w:rPr>
           <w:color w:val="C00000"/>
         </w:rPr>
-        <w:t>Uma das filhas do Didi hoje trabalha como motorista de aplicativo e já precisou pedir ajuda na internet para comprar remédio. E essa é só a primeira das histórias que o público nunca ouviu.</w:t>
+        <w:t>O que pouca gente sabe é que existe uma parte da vida do Didi que nunca apareceu na televisão. E quem conviveu com ele de perto descreve um homem muito diferente daquele que o Brasil aprendeu a amar.</w:t>
       </w:r>
     </w:p>
     <w:p>
@@ -31,7 +31,7 @@
         <w:rPr>
           <w:color w:val="C00000"/>
         </w:rPr>
-        <w:t>Fique até o final, porque você vai descobrir o que Mussum e Zacarias viveram nos bastidores dos Trapalhões. E a frase cruel que, segundo quem estava lá, o Didi disse sobre os próprios parceiros.</w:t>
+        <w:t>Fique até o final, porque você vai descobrir o que acontecia quando as câmeras desligavam. E a frase cruel que, segundo quem estava lá, ele disse sobre as pessoas que ajudaram a construir a fama dele.</w:t>
       </w:r>
     </w:p>
     <w:p>

</xml_diff>

<commit_message>
Renato Aragão: revisão parte 1
Co-Authored-By: Claude Opus 5.5 <noreply@anthropic.com>
Claude-Session: https://claude.ai/code/session_01MJjUEEZrxQDEUifKK2vj9g
</commit_message>
<xml_diff>
--- a/roteiros/renato-aragao/RenatoAragao_Parte1_Introducao.docx
+++ b/roteiros/renato-aragao/RenatoAragao_Parte1_Introducao.docx
@@ -39,7 +39,7 @@
         <w:rPr>
           <w:color w:val="000000"/>
         </w:rPr>
-        <w:t>Mas, para entender como o palhaço mais querido do país chegou a esse ponto, é preciso abrir um arquivo que muita gente preferiu manter fechado.</w:t>
+        <w:t>Mas, para conhecer esse homem longe dos holofotes, é preciso abrir um arquivo que muita gente preferiu manter fechado.</w:t>
       </w:r>
     </w:p>
     <w:p>
@@ -119,7 +119,7 @@
         <w:rPr>
           <w:color w:val="C00000"/>
         </w:rPr>
-        <w:t>Guarde esse documentário na sua cabeça. Porque, nas horas de gravação que ninguém quis mostrar, há relatos sobre dinheiro e humilhações nos bastidores. E há uma frase atribuída ao Didi, dita no dia em que o grupo se desfez, tão sombria que muita gente se recusa a acreditar.</w:t>
+        <w:t>Guarde esse documentário na sua cabeça. Porque, nas horas de gravação que ninguém quis mostrar, há relatos sobre dinheiro e humilhações que nunca chegaram ao público. Um deles envolve uma cadeira nos bastidores. E o que teria sido deixado nela é difícil de acreditar.</w:t>
       </w:r>
     </w:p>
     <w:p>
@@ -127,7 +127,7 @@
         <w:rPr>
           <w:color w:val="000000"/>
         </w:rPr>
-        <w:t>Para entender por que tanta gente preferiu manter aquelas imagens no escuro, é preciso entender quem é o homem no centro delas.</w:t>
+        <w:t>Antes de chegar ao que está nessas gravações, é preciso conhecer o homem no centro delas.</w:t>
       </w:r>
     </w:p>
     <w:p>
@@ -167,7 +167,7 @@
         <w:rPr>
           <w:color w:val="000000"/>
         </w:rPr>
-        <w:t>Uma casa de gente letrada, no sertão cearense. Nada ali parecia empurrar o menino para o picadeiro. O caminho dele, na juventude, foi outro.</w:t>
+        <w:t>Uma casa de gente letrada, no sertão cearense. Nada ali parecia empurrar o menino para o picadeiro. O caminho dele foi outro.</w:t>
       </w:r>
     </w:p>
     <w:p>
@@ -215,7 +215,7 @@
         <w:rPr>
           <w:color w:val="000000"/>
         </w:rPr>
-        <w:t>No começo dos anos sessenta, a TV Ceará abriu um concurso. Renato, com vinte e quatro anos, se inscreveu e venceu.</w:t>
+        <w:t>No começo dos anos sessenta, a TV Ceará abriu um concurso. Renato se inscreveu e venceu.</w:t>
       </w:r>
     </w:p>
     <w:p>
@@ -287,7 +287,7 @@
         <w:rPr>
           <w:color w:val="C00000"/>
         </w:rPr>
-        <w:t>Quando Renato encontrou esses três homens, nasceu o maior fenômeno de humor da história da televisão brasileira. Mas, desde o primeiro dia, havia uma diferença entre eles que o público nunca percebeu. Uma diferença que ia aparecer, anos mais tarde, em contratos com números difíceis de acreditar.</w:t>
+        <w:t>Quando Renato encontrou esses três homens, nasceu um dos maiores fenômenos de humor da televisão brasileira. Mas, desde o primeiro dia, havia uma diferença entre eles que o público nunca percebeu. Uma diferença que ia aparecer, anos mais tarde, em contratos com números difíceis de acreditar.</w:t>
       </w:r>
     </w:p>
     <w:p>
@@ -311,7 +311,7 @@
         <w:rPr>
           <w:color w:val="000000"/>
         </w:rPr>
-        <w:t>Dedé Santana, parceiro de longa data, filho de artistas de circo. Mussum, sambista, integrante dos Originais do Samba, com o jeito de falar que virou marca registrada. E Zacarias, com a risada que virou marca.</w:t>
+        <w:t>Dedé Santana, parceiro de longa data, filho de artistas de circo. Mussum, sambista, integrante dos Originais do Samba, com o jeito de falar que virou marca registrada. E Zacarias, dono de uma risada que ninguém esquecia.</w:t>
       </w:r>
     </w:p>
     <w:p>
@@ -367,7 +367,7 @@
         <w:rPr>
           <w:color w:val="C00000"/>
         </w:rPr>
-        <w:t>Porque, por trás das risadas, existia uma empresa. E os papéis que saíam dessa empresa mostravam quem realmente mandava nos Trapalhões. Quando esses contratos vieram à tona, quarenta anos depois, muita gente entendeu por que a amizade dos quatro explodiu em mil novecentos e oitenta e três.</w:t>
+        <w:t>Porque, por trás das risadas, existia uma empresa. E os papéis que saíam dessa empresa mostravam quem realmente mandava nos Trapalhões. Quando esses contratos vieram à tona, décadas depois, muita gente entendeu por que a amizade dos quatro explodiu em mil novecentos e oitenta e três.</w:t>
       </w:r>
     </w:p>
     <w:sectPr>

</xml_diff>